<commit_message>
Fold verified regulatory facts into flags; unbundle site follow-up consent
Engine: DOSM state/district boundaries (open licence, includes
Putrajaya); Copernicus WorldDEM-30 attribution and liability notice per
its licence; flags rewritten against the 2009 PLANMalaysia hill/highland
guideline (slope classes and elevation bands), EIA Order 2015
P.U.(A) 195/2015 slope and area items, Act 133 s.70(2)(c), Penang and
Pahang state rules, PV slope practice and an IFC-based gross capacity
range.

Web: staff follow-up is now a separate, unticked, per-report opt-in
that can be withdrawn; admin lead export only includes consented
reports; bilingual privacy notice redrafted for legal review; age
statement; Amazon SES API mail backend (SES has no SMTP endpoint in
ap-southeast-5); README rewritten as the owner's guide.

Co-Authored-By: Claude Opus 5.5 <noreply@anthropic.com>
Claude-Session: https://claude.ai/code/session_01WKQ9tXC8XMN7yTZMoHtbno
</commit_message>
<xml_diff>
--- a/terrain-tool/docs/samples/kedah_flat_paddy/terrain-screening-kedah.docx
+++ b/terrain-tool/docs/samples/kedah_flat_paddy/terrain-screening-kedah.docx
@@ -226,7 +226,7 @@
                 <w:color w:val="12233A"/>
                 <w:sz w:val="18"/>
               </w:rPr>
-              <w:t>13 October 2026, 09:36 MYT</w:t>
+              <w:t>13 October 2026, 10:08 MYT</w:t>
             </w:r>
           </w:p>
         </w:tc>
@@ -805,7 +805,7 @@
                 <w:color w:val="12233A"/>
                 <w:sz w:val="18"/>
               </w:rPr>
-              <w:t>0 warnings · 0 cautions · 3 for information</w:t>
+              <w:t>0 warnings · 0 cautions · 4 for information</w:t>
             </w:r>
           </w:p>
         </w:tc>
@@ -940,7 +940,7 @@
                 <w:color w:val="12233A"/>
                 <w:sz w:val="20"/>
               </w:rPr>
-              <w:t>Site area screens as KPKT Class I (below 15°)</w:t>
+              <w:t>Site area screens as KPKT Class I by slope (below 15°)</w:t>
             </w:r>
           </w:p>
           <w:p>
@@ -952,7 +952,7 @@
                 <w:color w:val="12233A"/>
                 <w:sz w:val="18"/>
               </w:rPr>
-              <w:t>No site has more than 0.5% of its area at 15° or steeper on this DEM, so the land screens as Class I, which the KPKT hill-land guidelines generally treat as developable. A 30 m elevation model smooths out short steep features such as bund faces, drain banks and cuttings, so a survey can still find locally steeper ground.</w:t>
+              <w:t>No site has more than 0.5% of its area at 15° or steeper on this DEM, so by slope alone the land screens as KPKT Class I (low geotechnical constraint). Below 300 m the guideline lets all types of development be considered on Class I ground, subject to the local or development plan. This is a slope-based indication only: the guideline also places gentle ground in a higher class where it shows erosion or instability, lies on colluvium or other sensitive geological material, is limestone, swamp, peat or ex-mining land, or is under flood threat. A 30 m elevation model also smooths out short steep features such as bund faces, drain banks and cuttings.</w:t>
             </w:r>
           </w:p>
           <w:p>
@@ -965,7 +965,105 @@
                 <w:color w:val="48586C"/>
                 <w:sz w:val="15"/>
               </w:rPr>
-              <w:t>Source: KPKT hill-land development guidelines (Garis Panduan Perancangan Pembangunan di Kawasan Bukit dan Tanah Tinggi)</w:t>
+              <w:t>Source: PLANMalaysia (then JPBD Semenanjung Malaysia, KPKT), Garis Panduan Perancangan Pembangunan di Kawasan Bukit dan Tanah Tinggi (2009), Jadual 1</w:t>
+            </w:r>
+          </w:p>
+        </w:tc>
+      </w:tr>
+    </w:tbl>
+    <w:p>
+      <w:pPr>
+        <w:spacing w:before="0" w:after="0" w:line="100" w:lineRule="exact"/>
+      </w:pPr>
+      <w:r>
+        <w:rPr>
+          <w:sz w:val="10"/>
+        </w:rPr>
+      </w:r>
+    </w:p>
+    <w:tbl>
+      <w:tblPr>
+        <w:tblW w:type="dxa" w:w="9865"/>
+        <w:jc w:val="left"/>
+        <w:tblBorders>
+          <w:top w:val="nil"/>
+          <w:left w:val="nil"/>
+          <w:bottom w:val="nil"/>
+          <w:right w:val="nil"/>
+          <w:insideH w:val="nil"/>
+          <w:insideV w:val="nil"/>
+        </w:tblBorders>
+        <w:tblLayout w:type="fixed"/>
+        <w:tblLook w:firstColumn="1" w:firstRow="1" w:lastColumn="0" w:lastRow="0" w:noHBand="0" w:noVBand="1" w:val="04A0"/>
+      </w:tblPr>
+      <w:tblGrid>
+        <w:gridCol w:w="9865"/>
+      </w:tblGrid>
+      <w:tr>
+        <w:tc>
+          <w:tcPr>
+            <w:tcW w:type="dxa" w:w="9865"/>
+            <w:tcBorders>
+              <w:left w:val="single" w:sz="36" w:space="0" w:color="0F2742"/>
+            </w:tcBorders>
+            <w:shd w:val="clear" w:color="auto" w:fill="EDF1F6"/>
+            <w:tcMar>
+              <w:top w:w="110" w:type="dxa"/>
+              <w:left w:w="200" w:type="dxa"/>
+              <w:bottom w:w="130" w:type="dxa"/>
+              <w:right w:w="200" w:type="dxa"/>
+            </w:tcMar>
+          </w:tcPr>
+          <w:p>
+            <w:pPr>
+              <w:spacing w:before="0" w:after="20" w:line="240" w:lineRule="auto"/>
+            </w:pPr>
+            <w:r>
+              <w:rPr>
+                <w:b/>
+                <w:color w:val="0F2742"/>
+                <w:spacing w:val="12"/>
+                <w:sz w:val="14"/>
+              </w:rPr>
+              <w:t>INFORMATION</w:t>
+            </w:r>
+          </w:p>
+          <w:p>
+            <w:pPr>
+              <w:spacing w:before="0" w:after="40" w:line="240" w:lineRule="auto"/>
+            </w:pPr>
+            <w:r>
+              <w:rPr>
+                <w:b/>
+                <w:color w:val="12233A"/>
+                <w:sz w:val="20"/>
+              </w:rPr>
+              <w:t>Indicative gross capacity from site area</w:t>
+            </w:r>
+          </w:p>
+          <w:p>
+            <w:pPr>
+              <w:spacing w:before="0" w:after="0" w:line="276" w:lineRule="auto"/>
+            </w:pPr>
+            <w:r>
+              <w:rPr>
+                <w:color w:val="12233A"/>
+                <w:sz w:val="18"/>
+              </w:rPr>
+              <w:t>Using IFC (2015) Table 7, about 0.8–1.2 ha per MWp for crystalline-silicon ground-mounted PV in Thailand and Indonesia (the closest climates listed): the total polygon area of 42.16 ha gives about 35–53 MWp; on the DEM all of it is flatter than about 8.5° (15% grade). These are gross figures, before setbacks, access roads, drainage reserves, shading, steep or unsuitable ground and grid limits; the exact area per MWp varies with the tilt angle and row spacing (pitch).</w:t>
+            </w:r>
+          </w:p>
+          <w:p>
+            <w:pPr>
+              <w:spacing w:before="60" w:after="0" w:line="240" w:lineRule="auto"/>
+            </w:pPr>
+            <w:r>
+              <w:rPr>
+                <w:i/>
+                <w:color w:val="48586C"/>
+                <w:sz w:val="15"/>
+              </w:rPr>
+              <w:t>Source: IFC (2015) Utility-Scale Solar Photovoltaic Power Plants: A Project Developer's Guide, Table 7</w:t>
             </w:r>
           </w:p>
         </w:tc>
@@ -1050,7 +1148,7 @@
                 <w:color w:val="12233A"/>
                 <w:sz w:val="18"/>
               </w:rPr>
-              <w:t>Steepest gradient along each route, measured over at least 90 m — “33 kV cable route”: max grade 2.1% over 2.03 km (total climb 5 m). Short pitches at drains, embankments and road crossings can be steeper than a 30 m DEM shows.</w:t>
+              <w:t>Steepest gradient along each route, measured over at least 90 m — “33 kV cable route”: max grade 2.1% over 2.03 km (total climb 5 m). Short pitches at drains, embankments and road crossings can be steeper than a 30 m DEM shows, and a route that crosses a slope at an angle has a lower grade than the slope itself.</w:t>
             </w:r>
           </w:p>
         </w:tc>
@@ -1123,7 +1221,7 @@
                 <w:color w:val="12233A"/>
                 <w:sz w:val="20"/>
               </w:rPr>
-              <w:t>Check EIA requirements for the total area</w:t>
+              <w:t>EIA Order 2015: area-based items to check</w:t>
             </w:r>
           </w:p>
           <w:p>
@@ -1135,7 +1233,7 @@
                 <w:color w:val="12233A"/>
                 <w:sz w:val="18"/>
               </w:rPr>
-              <w:t>Total polygon area is 42.16 ha. Whether an Environmental Impact Assessment is required depends on the activity and area categories in the schedules of the Environmental Quality (Prescribed Activities) (Environmental Impact Assessment) Order 2015, and on factors such as hill land, forest clearing or conversion of agricultural land. Have a qualified EIA consultant check the site against the current schedules.</w:t>
+              <w:t>Solar PV is not listed among the power-generation items of the EIA Order 2015 at any capacity. Area-based items may still apply, depending on the land cover and what is cleared, converted or drained: First Schedule 5(a), conversion of forest at 300 m or more above mean sea level to other land use, 20 ha to under 100 ha (Second Schedule 5(a): 100 ha or more); First Schedule 5(d), conversion of mangrove, peat swamp or freshwater swamp forest for industrial, housing or agricultural use, 20 ha to under 50 ha (Second Schedule 5(f): 50 ha or more); Second Schedule 3(b), drainage of wetland, wildlife habitat or dry inland forest covering 20 ha or more; First Schedule 17, development of an industrial estate of 20 ha or more — whether DOE treats a solar farm as an industrial estate is not settled. The total polygon area is 42.16 ha; the thresholds apply to the area actually cleared, converted or drained. Second Schedule activities also require public display and public comment. Have a DOE-registered EIA consultant confirm which items apply.</w:t>
             </w:r>
           </w:p>
           <w:p>
@@ -1148,7 +1246,7 @@
                 <w:color w:val="48586C"/>
                 <w:sz w:val="15"/>
               </w:rPr>
-              <w:t>Source: Environmental Quality (Prescribed Activities) (Environmental Impact Assessment) Order 2015, under the Environmental Quality Act 1974</w:t>
+              <w:t>Source: Environmental Quality (Prescribed Activities) (Environmental Impact Assessment) Order 2015, P.U. (A) 195/2015, First Schedule items 5(a), 5(d) and 17; Second Schedule items 3(b), 5(a) and 5(f); item 11 (power generation)</w:t>
             </w:r>
           </w:p>
         </w:tc>
@@ -2936,7 +3034,7 @@
         <w:t xml:space="preserve">Figure 2. </w:t>
       </w:r>
       <w:r>
-        <w:t>Shaded Copernicus DEM GLO-30 surface elevation with contours every 5 m; tree canopy and buildings are included in the surface.</w:t>
+        <w:t>Shaded Copernicus DEM GLO-30 elevation with contours every 5 m; tree canopy and buildings are included in the surface.</w:t>
       </w:r>
     </w:p>
     <w:p>
@@ -2999,7 +3097,7 @@
         <w:t xml:space="preserve">Figure 3. </w:t>
       </w:r>
       <w:r>
-        <w:t>Slope from the elevation model in seven bands, with the KPKT class boundaries at 15°, 25° and 35°; 100.0% of the site area is KPKT Class I (below 15°).</w:t>
+        <w:t>Slope from the elevation model in seven bands, with the KPKT slope-class boundaries at 15°, 25° and 35°; by slope alone, 100.0% of the site area is Class I (below 15°).</w:t>
       </w:r>
     </w:p>
     <w:p>
@@ -3090,7 +3188,7 @@
         <w:br/>
       </w:r>
       <w:r>
-        <w:t>Before layout, earthworks or drainage design, commission a topographic survey by a licensed land surveyor (Licensed Land Surveyors Act 1958), or LiDAR / drone photogrammetry tied to surveyed ground control points.</w:t>
+        <w:t>Before layout, earthworks or drainage design, commission a topographic survey by a licensed land surveyor (Licensed Land Surveyors Act 1958, Act 458), or LiDAR / drone photogrammetry tied to surveyed ground control points.</w:t>
       </w:r>
     </w:p>
     <w:p>
@@ -3179,6 +3277,25 @@
           <w:b/>
           <w:color w:val="0F2742"/>
         </w:rPr>
+        <w:t>Confirm EIA applicability with a DOE-registered EIA consultant</w:t>
+      </w:r>
+      <w:r>
+        <w:br/>
+      </w:r>
+      <w:r>
+        <w:t>Have a DOE-registered EIA consultant check the layout, land cover and areas to be cleared against the First and Second Schedules of the EIA Order 2015 (in Sabah and Sarawak, against the state's requirements) before committing to the site.</w:t>
+      </w:r>
+    </w:p>
+    <w:p>
+      <w:pPr>
+        <w:pStyle w:val="ListNumber"/>
+        <w:spacing w:after="120"/>
+      </w:pPr>
+      <w:r>
+        <w:rPr>
+          <w:b/>
+          <w:color w:val="0F2742"/>
+        </w:rPr>
         <w:t>Route wayleave and crossings</w:t>
       </w:r>
       <w:r>
@@ -3202,7 +3319,7 @@
         <w:spacing w:after="80"/>
       </w:pPr>
       <w:r>
-        <w:t>Screening grade only: this is a desktop terrain screening from an open global elevation model, not a survey.</w:t>
+        <w:t>Screening grade only: this is a desktop terrain screening from an open global elevation model. It is not a survey under the Licensed Land Surveyors Act 1958 (Act 458), not engineering design, and not for planning applications or any other authority submission.</w:t>
       </w:r>
     </w:p>
     <w:p>
@@ -3211,7 +3328,7 @@
         <w:spacing w:after="80"/>
       </w:pPr>
       <w:r>
-        <w:t>The Copernicus DEM GLO-30 is a surface model: it records the top of tree canopy and buildings, not bare ground. Plantations, forest and built-up areas read higher than the ground beneath them, and slopes at their edges can be exaggerated.</w:t>
+        <w:t>The Copernicus DEM GLO-30 is a digital surface model (DSM): vegetation and buildings were not removed, so plantations, forest and built-up areas read higher than the ground beneath them, and slopes at their edges can be exaggerated. Water bodies were flattened during editing, so over water it shows a level surface and nothing about depth.</w:t>
       </w:r>
     </w:p>
     <w:p>
@@ -3220,7 +3337,7 @@
         <w:spacing w:after="80"/>
       </w:pPr>
       <w:r>
-        <w:t>Elevations show the ground as it was in 2011–2015 (TanDEM-X acquisitions). Ponds, cuttings, platforms and buildings made since then are not represented.</w:t>
+        <w:t>Accuracy: the Copernicus DEM specification is an absolute vertical accuracy better than 4 m and a relative vertical accuracy better than 2 m on slopes up to 20% (4 m on steeper slopes), both as 90% linear error (LE90). Independent checks are weaker under forest: in a global study against ICESat-2 ground heights where canopy cover exceeded 50%, 90% of errors were within 26.55 m and the mean error was +12.09 m, so the model read high (Hawker et al. 2022, Environ. Res. Lett. 17 024016). Against 38 GNSS benchmarks in Perlis, Malaysia, its RMSE was 2.45 m (Sibaruddin et al. 2026).</w:t>
       </w:r>
     </w:p>
     <w:p>
@@ -3229,7 +3346,52 @@
         <w:spacing w:after="80"/>
       </w:pPr>
       <w:r>
-        <w:t>The nominal 30 m resolution (analysed at about 31 m) smooths out bunds, drains and short steep cuttings, so local slopes are underestimated.</w:t>
+        <w:t>Elevations show the surface as it was in December 2010 – January 2015 (TanDEM-X acquisitions). Ponds, cuttings, platforms and buildings made since then are not represented.</w:t>
+      </w:r>
+    </w:p>
+    <w:p>
+      <w:pPr>
+        <w:pStyle w:val="ListBullet"/>
+        <w:spacing w:after="80"/>
+      </w:pPr>
+      <w:r>
+        <w:t>Slopes are computed on a grid of about 31 m (nominal 30 m resolution). Each slope value averages over neighbouring cells, so short steep features such as bund faces, drain banks, stream banks and cuttings are smoothed out, and the shares of ground steeper than 15°, 25° and 35° are likely to be understated.</w:t>
+      </w:r>
+    </w:p>
+    <w:p>
+      <w:pPr>
+        <w:pStyle w:val="ListBullet"/>
+        <w:spacing w:after="80"/>
+      </w:pPr>
+      <w:r>
+        <w:t>Contours are drawn every 5 m; this tool never draws them finer than 5 m. The ASPRS Positional Accuracy Standards (2014, repeated in 2023) relate a contour interval to digital elevation data as twice the 90% vertical error (LE90); with the specified relative LE90 of under 2 m on slopes up to 20%, that is up to about 4 m, so 5 m is the finest honest interval for this model. Contours are for context, not design.</w:t>
+      </w:r>
+    </w:p>
+    <w:p>
+      <w:pPr>
+        <w:pStyle w:val="ListBullet"/>
+        <w:spacing w:after="80"/>
+      </w:pPr>
+      <w:r>
+        <w:t>Slope direction (aspect) is not assessed. At Malaysian latitudes (about 1–7°N) it is secondary to earthworks, drainage and geotechnics: the Global Solar Atlas gives optimum fixed tilts of only 2–8° at four sample points across Malaysia, gaining under 1% over horizontal. IFC (2015, s.6.3.4) says a site should ideally be flat or on a slight south-facing slope in the northern hemisphere.</w:t>
+      </w:r>
+    </w:p>
+    <w:p>
+      <w:pPr>
+        <w:pStyle w:val="ListBullet"/>
+        <w:spacing w:after="80"/>
+      </w:pPr>
+      <w:r>
+        <w:t>State and district come from DOSM boundaries at the centroid of the uploaded features and are for orientation; the state-specific notes depend on that lookup. Local authority areas, Special Management Areas, forest reserves and land titles are not checked.</w:t>
+      </w:r>
+    </w:p>
+    <w:p>
+      <w:pPr>
+        <w:pStyle w:val="ListBullet"/>
+        <w:spacing w:after="80"/>
+      </w:pPr>
+      <w:r>
+        <w:t>Regulatory notes summarise published instruments and, where marked, news reports. They are a screening aid, not legal advice; requirements change and are applied by the relevant authorities, so confirm them before relying on them.</w:t>
       </w:r>
     </w:p>
     <w:p>
@@ -3239,15 +3401,6 @@
       </w:pPr>
       <w:r>
         <w:t>Site geometry is used exactly as supplied in the uploaded KML/KMZ file; it has not been checked against title plans or survey boundaries.</w:t>
-      </w:r>
-    </w:p>
-    <w:p>
-      <w:pPr>
-        <w:pStyle w:val="ListBullet"/>
-        <w:spacing w:after="80"/>
-      </w:pPr>
-      <w:r>
-        <w:t>Not for authority submissions or design: planning applications, earthworks, drainage and structural design need a licensed survey and qualified engineers.</w:t>
       </w:r>
     </w:p>
     <w:p>
@@ -3270,7 +3423,22 @@
         <w:t xml:space="preserve">Elevation data: </w:t>
       </w:r>
       <w:r>
-        <w:t>Copernicus DEM GLO-30 © DLR e.V. 2010–2014 and © Airbus Defence and Space GmbH 2014–2018, provided under COPERNICUS by the European Union and ESA; all rights reserved.</w:t>
+        <w:t>Produced using Copernicus WorldDEM-30 © DLR e.V. 2010-2014 and © Airbus Defence and Space GmbH 2014-2018 provided under COPERNICUS by the European Union and ESA; all rights reserved.</w:t>
+      </w:r>
+    </w:p>
+    <w:p>
+      <w:pPr>
+        <w:pStyle w:val="ListBullet"/>
+        <w:spacing w:after="80"/>
+      </w:pPr>
+      <w:r>
+        <w:rPr>
+          <w:b/>
+        </w:rPr>
+        <w:t xml:space="preserve">Elevation data notice: </w:t>
+      </w:r>
+      <w:r>
+        <w:t>The organisations in charge of the Copernicus programme by law or by delegation do not incur any liability for any use of the Copernicus WorldDEM-30.</w:t>
       </w:r>
     </w:p>
     <w:p>
@@ -3285,7 +3453,7 @@
         <w:t xml:space="preserve">Elevation model: </w:t>
       </w:r>
       <w:r>
-        <w:t>Copernicus DEM GLO-30; DSM (surface model: includes tree canopy and buildings); acquired 2011–2015 (TanDEM-X acquisitions); vertical datum EGM2008; 30 m nominal resolution, analysed at 30.7 m over 6,402 cells (0.0% without data).</w:t>
+        <w:t>Copernicus DEM GLO-30; DSM (surface model: includes tree canopy and buildings); acquired December 2010 – January 2015 (TanDEM-X acquisitions); vertical datum EGM2008; 30 m nominal resolution, analysed at 30.7 m over 6,402 cells (0.0% without data).</w:t>
       </w:r>
     </w:p>
     <w:p>
@@ -3297,10 +3465,10 @@
         <w:rPr>
           <w:b/>
         </w:rPr>
-        <w:t xml:space="preserve">Administrative boundaries: </w:t>
+        <w:t xml:space="preserve">State and district boundaries: </w:t>
       </w:r>
       <w:r>
-        <w:t>geoBoundaries (gbOpen) — states © OpenStreetMap contributors (ODbL 1.0); districts citypopulation.de (CC BY 3.0).</w:t>
+        <w:t>Department of Statistics Malaysia (DOSM) open data (github.com/dosm-malaysia/data-open), used under the DOSM Open Data Licence. No endorsement by DOSM is implied.</w:t>
       </w:r>
     </w:p>
     <w:p>

</xml_diff>